<commit_message>
docs: add date to generalization docs
</commit_message>
<xml_diff>
--- a/docs/泛化能力迭代_0412.docx
+++ b/docs/泛化能力迭代_0412.docx
@@ -53,7 +53,28 @@
       </w:r>
       <w:r>
         <w:rPr/>
-        <w:t>Manus AI**</w:t>
+        <w:t xml:space="preserve">Manus AI**  </w:t>
+      </w:r>
+    </w:p>
+    <w:p>
+      <w:pPr>
+        <w:pStyle w:val="PreformattedText"/>
+        <w:bidi w:val="0"/>
+        <w:spacing w:before="0" w:after="0"/>
+        <w:jc w:val="left"/>
+        <w:rPr/>
+      </w:pPr>
+      <w:r>
+        <w:rPr/>
+        <w:t>**</w:t>
+      </w:r>
+      <w:r>
+        <w:rPr/>
+        <w:t>日期：</w:t>
+      </w:r>
+      <w:r>
+        <w:rPr/>
+        <w:t>2026-04-12**</w:t>
       </w:r>
     </w:p>
     <w:p>

</xml_diff>